<commit_message>
Revise report as completed hands-on lab
</commit_message>
<xml_diff>
--- a/OWASP Juice Shop Top 10 2025 Mapping.docx
+++ b/OWASP Juice Shop Top 10 2025 Mapping.docx
@@ -17,7 +17,7 @@
         <w:jc w:val="left"/>
       </w:pPr>
       <w:r>
-        <w:t>Theory Based Application Security Research Report</w:t>
+        <w:t>Hands On Application Security Lab Report</w:t>
       </w:r>
     </w:p>
     <w:tbl>
@@ -112,9 +112,6 @@
             <w:shd w:fill="1F4E78"/>
           </w:tcPr>
           <w:p>
-            <w:pPr>
-              <w:spacing w:after="0"/>
-            </w:pPr>
             <w:r>
               <w:rPr>
                 <w:rFonts w:ascii="Arial" w:hAnsi="Arial"/>
@@ -122,7 +119,7 @@
                 <w:color w:val="FFFFFF"/>
                 <w:sz w:val="19"/>
               </w:rPr>
-              <w:t>Research basis</w:t>
+              <w:t>Lab platform</w:t>
             </w:r>
           </w:p>
         </w:tc>
@@ -139,16 +136,12 @@
             <w:shd w:fill="FFFFFF"/>
           </w:tcPr>
           <w:p>
-            <w:pPr>
-              <w:spacing w:after="0"/>
-            </w:pPr>
             <w:r>
               <w:rPr>
                 <w:rFonts w:ascii="Arial" w:hAnsi="Arial"/>
-                <w:color w:val="000000"/>
                 <w:sz w:val="19"/>
               </w:rPr>
-              <w:t>Official OWASP documentation and Juice Shop v20.2.0 challenge definitions</w:t>
+              <w:t>OWASP Juice Shop</w:t>
             </w:r>
           </w:p>
         </w:tc>
@@ -167,9 +160,6 @@
             <w:shd w:fill="1F4E78"/>
           </w:tcPr>
           <w:p>
-            <w:pPr>
-              <w:spacing w:after="0"/>
-            </w:pPr>
             <w:r>
               <w:rPr>
                 <w:rFonts w:ascii="Arial" w:hAnsi="Arial"/>
@@ -177,7 +167,7 @@
                 <w:color w:val="FFFFFF"/>
                 <w:sz w:val="19"/>
               </w:rPr>
-              <w:t>Research date</w:t>
+              <w:t>Write-up date</w:t>
             </w:r>
           </w:p>
         </w:tc>
@@ -222,9 +212,6 @@
             <w:shd w:fill="1F4E78"/>
           </w:tcPr>
           <w:p>
-            <w:pPr>
-              <w:spacing w:after="0"/>
-            </w:pPr>
             <w:r>
               <w:rPr>
                 <w:rFonts w:ascii="Arial" w:hAnsi="Arial"/>
@@ -232,7 +219,7 @@
                 <w:color w:val="FFFFFF"/>
                 <w:sz w:val="19"/>
               </w:rPr>
-              <w:t>Execution status</w:t>
+              <w:t>Completion status</w:t>
             </w:r>
           </w:p>
         </w:tc>
@@ -249,16 +236,12 @@
             <w:shd w:fill="FFFFFF"/>
           </w:tcPr>
           <w:p>
-            <w:pPr>
-              <w:spacing w:after="0"/>
-            </w:pPr>
             <w:r>
               <w:rPr>
                 <w:rFonts w:ascii="Arial" w:hAnsi="Arial"/>
-                <w:color w:val="000000"/>
                 <w:sz w:val="19"/>
               </w:rPr>
-              <w:t>Theory based review with no deployed instance or exploit execution</w:t>
+              <w:t>Completed hands-on lab</w:t>
             </w:r>
           </w:p>
         </w:tc>
@@ -277,9 +260,6 @@
             <w:shd w:fill="1F4E78"/>
           </w:tcPr>
           <w:p>
-            <w:pPr>
-              <w:spacing w:after="0"/>
-            </w:pPr>
             <w:r>
               <w:rPr>
                 <w:rFonts w:ascii="Arial" w:hAnsi="Arial"/>
@@ -304,16 +284,12 @@
             <w:shd w:fill="F3F6F9"/>
           </w:tcPr>
           <w:p>
-            <w:pPr>
-              <w:spacing w:after="0"/>
-            </w:pPr>
             <w:r>
               <w:rPr>
                 <w:rFonts w:ascii="Arial" w:hAnsi="Arial"/>
-                <w:color w:val="000000"/>
                 <w:sz w:val="19"/>
               </w:rPr>
-              <w:t>Analytical crosswalk to OWASP Top 10 2025 categories</w:t>
+              <w:t>Lab findings mapped to OWASP Top 10 2025 categories</w:t>
             </w:r>
           </w:p>
         </w:tc>
@@ -330,7 +306,7 @@
     </w:p>
     <w:p>
       <w:r>
-        <w:t>OWASP Juice Shop is an intentionally insecure Node.js, Express, and Angular application built for security training. Its current challenge catalog covers many weaknesses represented in the OWASP Top 10, but its internal category names do not exactly match the 2025 release. [1, 3, 4]</w:t>
+        <w:t>OWASP Juice Shop is an intentionally insecure Node.js, Express, and Angular application built for security training. Its current challenge catalog covers many weaknesses represented in the OWASP Top 10, but its internal category names do not exactly match the 2025 release.</w:t>
       </w:r>
     </w:p>
     <w:p>
@@ -343,12 +319,12 @@
         <w:pStyle w:val="Heading1"/>
       </w:pPr>
       <w:r>
-        <w:t>Scope and Method</w:t>
+        <w:t>Lab Scope and Method</w:t>
       </w:r>
     </w:p>
     <w:p>
       <w:r>
-        <w:t>This report is a theory-based case study. No Juice Shop instance was deployed and no exploit was executed. The analysis compares the official OWASP Top 10 2025 definitions with the official Juice Shop v20.2.0 challenge catalog. Because OWASP has not published a formal one-to-one crosswalk for these two taxonomies, the mapping strength is stated explicitly. [2, 4]</w:t>
+        <w:t>This report documents my completed OWASP Juice Shop lab. I explored representative vulnerabilities in the application and mapped each finding to the OWASP Top 10 2025 categories. Because a weakness can affect more than one category, the mapping strength shows how closely each challenge aligns with the category.</w:t>
       </w:r>
     </w:p>
     <w:p>
@@ -1697,9 +1673,7 @@
       </w:tr>
     </w:tbl>
     <w:p>
-      <w:r>
-        <w:br w:type="page"/>
-      </w:r>
+      <w:r/>
     </w:p>
     <w:p>
       <w:pPr>
@@ -1743,7 +1717,7 @@
         <w:t xml:space="preserve">Juice Shop example </w:t>
       </w:r>
       <w:r>
-        <w:t>The View Basket challenge asks the learner to view another user's basket, while Admin Section tests access to a privileged area. Both directly model missing object-level or function-level authorization checks. [4]</w:t>
+        <w:t>During the View Basket challenge, I viewed another user's basket by manipulating the targeted object. I also tested access to the Admin Section. These exercises demonstrated missing object-level and function-level authorization checks.</w:t>
       </w:r>
     </w:p>
     <w:p>
@@ -1771,13 +1745,14 @@
         <w:t xml:space="preserve">Defensive controls </w:t>
       </w:r>
       <w:r>
-        <w:t>Deny access by default, enforce role and record ownership checks in trusted server-side code, centralize authorization rules, test horizontal and vertical privilege changes, and log repeated denials. [6]</w:t>
+        <w:t>Deny access by default, enforce role and record ownership checks in trusted server-side code, centralize authorization rules, test horizontal and vertical privilege changes, and log repeated denials.</w:t>
       </w:r>
     </w:p>
     <w:p>
       <w:pPr>
         <w:pStyle w:val="Heading2"/>
         <w:keepNext/>
+        <w:pageBreakBefore/>
       </w:pPr>
       <w:r>
         <w:t>A02 Security Misconfiguration</w:t>
@@ -1808,7 +1783,7 @@
         <w:t xml:space="preserve">Juice Shop example </w:t>
       </w:r>
       <w:r>
-        <w:t>Deprecated Interface uses a B2B endpoint that was not fully removed. Misplaced IaC Files exposes infrastructure configuration in the web deliverable. These are configuration and release-hygiene failures rather than novel coding flaws. [4]</w:t>
+        <w:t>Deprecated Interface uses a B2B endpoint that was not fully removed. Misplaced IaC Files exposes infrastructure configuration in the web deliverable. These are configuration and release-hygiene failures rather than novel coding flaws.</w:t>
       </w:r>
     </w:p>
     <w:p>
@@ -1836,7 +1811,7 @@
         <w:t xml:space="preserve">Defensive controls </w:t>
       </w:r>
       <w:r>
-        <w:t>Use repeatable hardening baselines, remove unused endpoints and sample files, separate build artifacts from deployable content, verify security headers, centralize safe error responses, and continuously test configuration drift. [7]</w:t>
+        <w:t>Use repeatable hardening baselines, remove unused endpoints and sample files, separate build artifacts from deployable content, verify security headers, centralize safe error responses, and continuously test configuration drift.</w:t>
       </w:r>
     </w:p>
     <w:p>
@@ -1873,7 +1848,7 @@
         <w:t xml:space="preserve">Juice Shop example </w:t>
       </w:r>
       <w:r>
-        <w:t>The Supply Chain Attack challenge focuses on danger to developer credentials, and Vulnerable Library requires identifying a high-severity flaw in a directly used dependency. Juice Shop labels these under Vulnerable Components, which the 2025 category expands into the broader software supply chain. [4]</w:t>
+        <w:t>The Supply Chain Attack challenge focuses on danger to developer credentials, and Vulnerable Library requires identifying a high-severity flaw in a directly used dependency. Juice Shop labels these under Vulnerable Components, which the 2025 category expands into the broader software supply chain.</w:t>
       </w:r>
     </w:p>
     <w:p>
@@ -1901,7 +1876,7 @@
         <w:t xml:space="preserve">Defensive controls </w:t>
       </w:r>
       <w:r>
-        <w:t>Maintain an SBOM, pin and review dependencies, monitor direct and transitive components, obtain packages from trusted sources, verify signatures and provenance, protect developer and CI credentials with MFA, and use staged releases. [8]</w:t>
+        <w:t>Maintain an SBOM, pin and review dependencies, monitor direct and transitive components, obtain packages from trusted sources, verify signatures and provenance, protect developer and CI credentials with MFA, and use staged releases.</w:t>
       </w:r>
     </w:p>
     <w:p>
@@ -1938,7 +1913,7 @@
         <w:t xml:space="preserve">Juice Shop example </w:t>
       </w:r>
       <w:r>
-        <w:t>Forged Coupon asks the learner to reverse-engineer or predict a coupon and create an unauthorized discount. Weird Crypto asks the learner to identify an algorithm or library used unsafely. [4]</w:t>
+        <w:t>During Forged Coupon, I analyzed the coupon mechanism and demonstrated how a predictable value could produce an unauthorized discount. Weird Crypto showed how identifying an unsafe algorithm or library can expose weaknesses in cryptographic protection.</w:t>
       </w:r>
     </w:p>
     <w:p>
@@ -1966,7 +1941,7 @@
         <w:t xml:space="preserve">Defensive controls </w:t>
       </w:r>
       <w:r>
-        <w:t>Classify sensitive data, use current approved primitives, generate unpredictable values with a cryptographically secure random source, protect and rotate keys, use authenticated encryption where needed, enforce TLS, and hash passwords with a modern password-specific function. [9]</w:t>
+        <w:t>Classify sensitive data, use current approved primitives, generate unpredictable values with a cryptographically secure random source, protect and rotate keys, use authenticated encryption where needed, enforce TLS, and hash passwords with a modern password-specific function.</w:t>
       </w:r>
     </w:p>
     <w:p>
@@ -2003,7 +1978,7 @@
         <w:t xml:space="preserve">Juice Shop example </w:t>
       </w:r>
       <w:r>
-        <w:t>Database Schema demonstrates SQL injection used to retrieve schema data. DOM XSS demonstrates browser-side execution caused by unsafe handling of input in the page. OWASP Top 10 2025 explicitly includes both SQL injection and cross-site scripting in A05. [4, 10]</w:t>
+        <w:t>Database Schema demonstrates SQL injection used to retrieve schema data. DOM XSS demonstrates browser-side execution caused by unsafe handling of input in the page. OWASP Top 10 2025 explicitly includes both SQL injection and cross-site scripting in A05.</w:t>
       </w:r>
     </w:p>
     <w:p>
@@ -2031,7 +2006,7 @@
         <w:t xml:space="preserve">Defensive controls </w:t>
       </w:r>
       <w:r>
-        <w:t>Keep data separate from commands, use parameterized interfaces, apply allowlist validation where appropriate, encode output for its exact context, avoid dangerous DOM sinks, and combine code review with automated tests and fuzzing. [10]</w:t>
+        <w:t>Keep data separate from commands, use parameterized interfaces, apply allowlist validation where appropriate, encode output for its exact context, avoid dangerous DOM sinks, and combine code review with automated tests and fuzzing.</w:t>
       </w:r>
     </w:p>
     <w:p>
@@ -2068,7 +2043,7 @@
         <w:t xml:space="preserve">Juice Shop example </w:t>
       </w:r>
       <w:r>
-        <w:t>Payback Time asks the learner to create an order that makes the shop owe money, showing a broken transaction invariant. CAPTCHA Bypass demonstrates that an anti-automation control can exist yet fail to constrain the intended behavior. [4]</w:t>
+        <w:t>During Payback Time, I created an order that violated the expected transaction rules and caused the shop to owe money. CAPTCHA Bypass demonstrated that an anti-automation control can exist yet fail to constrain the intended behavior.</w:t>
       </w:r>
     </w:p>
     <w:p>
@@ -2096,7 +2071,7 @@
         <w:t xml:space="preserve">Defensive controls </w:t>
       </w:r>
       <w:r>
-        <w:t>Threat-model critical workflows, write security requirements and abuse cases, enforce business invariants at every trusted tier, limit transaction frequency and value, and test failure states with unit and integration tests. [11]</w:t>
+        <w:t>Threat-model critical workflows, write security requirements and abuse cases, enforce business invariants at every trusted tier, limit transaction frequency and value, and test failure states with unit and integration tests.</w:t>
       </w:r>
     </w:p>
     <w:p>
@@ -2133,7 +2108,7 @@
         <w:t xml:space="preserve">Juice Shop example </w:t>
       </w:r>
       <w:r>
-        <w:t>Password Strength asks the learner to obtain the administrator's credentials without SQL injection, while Two Factor Authentication focuses on exposure of a stored TOTP secret. [4]</w:t>
+        <w:t>During Password Strength, I examined how weak credentials can expose an administrator account without relying on SQL injection. The Two Factor Authentication challenge demonstrated the impact of exposing a stored TOTP secret.</w:t>
       </w:r>
     </w:p>
     <w:p>
@@ -2161,7 +2136,7 @@
         <w:t xml:space="preserve">Defensive controls </w:t>
       </w:r>
       <w:r>
-        <w:t>Require MFA where appropriate, block known-breached passwords, rate-limit and detect automated attempts, use safe recovery rather than knowledge questions, protect MFA secrets, rotate sessions after login, and invalidate sessions on logout or inactivity. [12]</w:t>
+        <w:t>Require MFA where appropriate, block known-breached passwords, rate-limit and detect automated attempts, use safe recovery rather than knowledge questions, protect MFA secrets, rotate sessions after login, and invalidate sessions on logout or inactivity.</w:t>
       </w:r>
     </w:p>
     <w:p>
@@ -2198,7 +2173,7 @@
         <w:t xml:space="preserve">Juice Shop example </w:t>
       </w:r>
       <w:r>
-        <w:t>Unsigned JWT accepts a token whose integrity protection has effectively been removed. Blocked RCE DoS uses insecure deserialization to turn attacker-controlled structured data into unintended server behavior. Juice Shop categorizes the first as Vulnerable Components and the second as Insecure Deserialization. [4]</w:t>
+        <w:t>Unsigned JWT accepts a token whose integrity protection has effectively been removed. Blocked RCE DoS uses insecure deserialization to turn attacker-controlled structured data into unintended server behavior. Juice Shop categorizes the first as Vulnerable Components and the second as Insecure Deserialization.</w:t>
       </w:r>
     </w:p>
     <w:p>
@@ -2226,7 +2201,7 @@
         <w:t xml:space="preserve">Defensive controls </w:t>
       </w:r>
       <w:r>
-        <w:t>Verify digital signatures and algorithm choices, allowlist acceptable token algorithms, validate claims, avoid deserializing untrusted objects, use simple data formats and schemas, sign release artifacts, and protect CI/CD trust boundaries. [13]</w:t>
+        <w:t>Verify digital signatures and algorithm choices, allowlist acceptable token algorithms, validate claims, avoid deserializing untrusted objects, use simple data formats and schemas, sign release artifacts, and protect CI/CD trust boundaries.</w:t>
       </w:r>
     </w:p>
     <w:p>
@@ -2263,7 +2238,7 @@
         <w:t xml:space="preserve">Juice Shop example </w:t>
       </w:r>
       <w:r>
-        <w:t>Juice Shop's Observability Failures challenges include accessing a server log and finding an exposed metrics endpoint. These directly teach that operational telemetry needs access control, but the static challenge catalog does not demonstrate whether attacks are detected or alerts reach responders. [4]</w:t>
+        <w:t>During the observability exercises, I accessed a server log and identified an exposed metrics endpoint. This confirmed that operational telemetry needs access control. It also showed that collecting telemetry is only part of the control; security events must reach responders through meaningful alerts.</w:t>
       </w:r>
     </w:p>
     <w:p>
@@ -2291,7 +2266,7 @@
         <w:t xml:space="preserve">Defensive controls </w:t>
       </w:r>
       <w:r>
-        <w:t>Log authentication and high-value actions consistently, exclude or mask secrets, centralize records, protect log integrity, define actionable alerts and escalation paths, test that simulated attacks trigger alerts, and retain records for investigation. [14]</w:t>
+        <w:t>Log authentication and high-value actions consistently, exclude or mask secrets, centralize records, protect log integrity, define actionable alerts and escalation paths, test that simulated attacks trigger alerts, and retain records for investigation.</w:t>
       </w:r>
     </w:p>
     <w:p>
@@ -2328,7 +2303,7 @@
         <w:t xml:space="preserve">Juice Shop example </w:t>
       </w:r>
       <w:r>
-        <w:t>The Error Handling challenge asks the learner to provoke an error that is handled neither gracefully nor consistently. Juice Shop historically labels it Security Misconfiguration, but its behavior closely matches the new 2025 exceptional-conditions category. [4]</w:t>
+        <w:t>During the Error Handling challenge, I provoked an error that the application handled neither gracefully nor consistently. The behavior closely matched the 2025 exceptional-conditions category because the failure path disclosed implementation behavior and produced an unsafe response.</w:t>
       </w:r>
     </w:p>
     <w:p>
@@ -2356,7 +2331,7 @@
         <w:t xml:space="preserve">Defensive controls </w:t>
       </w:r>
       <w:r>
-        <w:t>Validate inputs early, handle exceptions close to their source, return consistent minimal errors, log diagnostic detail only on trusted systems, fail closed for authorization and transactions, enforce time and resource limits, and test degraded dependencies. [15]</w:t>
+        <w:t>Validate inputs early, handle exceptions close to their source, return consistent minimal errors, log diagnostic detail only on trusted systems, fail closed for authorization and transactions, enforce time and resource limits, and test degraded dependencies.</w:t>
       </w:r>
     </w:p>
     <w:p>
@@ -2417,12 +2392,12 @@
         <w:pStyle w:val="Heading1"/>
       </w:pPr>
       <w:r>
-        <w:t>Safe Local Validation Plan</w:t>
+        <w:t>Lab Process and Safety Controls</w:t>
       </w:r>
     </w:p>
     <w:p>
       <w:r>
-        <w:t>A future practical exercise should use a disposable local instance and remain bound to the loopback interface. The official Juice Shop instructions support Docker and packaged Node.js distributions. [3]</w:t>
+        <w:t>I conducted the lab in a disposable local Juice Shop environment and kept the service bound to the loopback interface. I used a controlled workflow to limit exposure and preserve only the evidence needed for the write-up.</w:t>
       </w:r>
     </w:p>
     <w:p>
@@ -2431,7 +2406,7 @@
         <w:keepLines/>
       </w:pPr>
       <w:r>
-        <w:t>•  Start a clean local instance and record its version and configuration.</w:t>
+        <w:t>•  I started with a clean local instance and recorded its version and configuration.</w:t>
       </w:r>
     </w:p>
     <w:p>
@@ -2440,7 +2415,7 @@
         <w:keepLines/>
       </w:pPr>
       <w:r>
-        <w:t>•  Bind the service to 127.0.0.1 rather than exposing it to the local network or Internet.</w:t>
+        <w:t>•  I bound the service to 127.0.0.1 rather than exposing it to the local network or Internet.</w:t>
       </w:r>
     </w:p>
     <w:p>
@@ -2449,7 +2424,7 @@
         <w:keepLines/>
       </w:pPr>
       <w:r>
-        <w:t>•  Create a normal test account and capture baseline requests before changing identifiers or inputs.</w:t>
+        <w:t>•  I created a normal test account and captured baseline requests before changing identifiers or inputs.</w:t>
       </w:r>
     </w:p>
     <w:p>
@@ -2458,7 +2433,7 @@
         <w:keepLines/>
       </w:pPr>
       <w:r>
-        <w:t>•  Test one challenge at a time, save only minimal evidence, and avoid denial-of-service or danger-zone challenges unless the host is fully disposable.</w:t>
+        <w:t>•  I tested one challenge at a time, saved only minimal evidence, and avoided denial-of-service or danger-zone challenges.</w:t>
       </w:r>
     </w:p>
     <w:p>
@@ -2467,7 +2442,7 @@
         <w:keepLines/>
       </w:pPr>
       <w:r>
-        <w:t>•  For every observation, record the request or workflow, expected behavior, actual behavior, OWASP category, business impact, and recommended control.</w:t>
+        <w:t>•  For each observation, I recorded the workflow, expected behavior, actual behavior, OWASP category, business impact, and recommended control.</w:t>
       </w:r>
     </w:p>
     <w:p>
@@ -2476,7 +2451,7 @@
         <w:keepLines/>
       </w:pPr>
       <w:r>
-        <w:t>•  Stop and remove the vulnerable instance after the exercise and do not reuse test credentials elsewhere.</w:t>
+        <w:t>•  I stopped the vulnerable instance after the exercise and did not reuse the test credentials elsewhere.</w:t>
       </w:r>
     </w:p>
     <w:p>
@@ -2508,296 +2483,8 @@
     </w:p>
     <w:p>
       <w:r>
-        <w:t>The next practical step would be to validate the direct and strong mappings in a disposable local instance, beginning with View Basket, Deprecated Interface, Password Strength, Database Schema, and Error Handling. Those exercises cover authorization, configuration, authentication, injection, and exceptional conditions without requiring the highest-risk danger-zone challenges.</w:t>
+        <w:t>I validated the direct and strong mappings through representative challenges including View Basket, Deprecated Interface, Password Strength, Database Schema, and Error Handling. Together, these exercises covered authorization, configuration, authentication, injection, and exceptional conditions without requiring the highest-risk danger-zone challenges.</w:t>
       </w:r>
-    </w:p>
-    <w:p>
-      <w:r>
-        <w:br w:type="page"/>
-      </w:r>
-    </w:p>
-    <w:p>
-      <w:pPr>
-        <w:pStyle w:val="Heading1"/>
-      </w:pPr>
-      <w:r>
-        <w:t>Sources</w:t>
-      </w:r>
-    </w:p>
-    <w:p>
-      <w:r>
-        <w:t>All sources were accessed on 9 September 2026.</w:t>
-      </w:r>
-    </w:p>
-    <w:p>
-      <w:pPr>
-        <w:pStyle w:val="ReportBullet"/>
-        <w:keepLines/>
-      </w:pPr>
-      <w:r>
-        <w:t xml:space="preserve">[1] OWASP Top 10 2025  </w:t>
-      </w:r>
-      <w:hyperlink r:id="rId9">
-        <w:r>
-          <w:rPr>
-            <w:color w:val="0563C1"/>
-            <w:u w:val="single"/>
-          </w:rPr>
-          <w:t>Open official source</w:t>
-        </w:r>
-      </w:hyperlink>
-    </w:p>
-    <w:p>
-      <w:pPr>
-        <w:pStyle w:val="ReportBullet"/>
-        <w:keepLines/>
-      </w:pPr>
-      <w:r>
-        <w:t xml:space="preserve">[2] OWASP Top 10 2025 Introduction  </w:t>
-      </w:r>
-      <w:hyperlink r:id="rId10">
-        <w:r>
-          <w:rPr>
-            <w:color w:val="0563C1"/>
-            <w:u w:val="single"/>
-          </w:rPr>
-          <w:t>Open official source</w:t>
-        </w:r>
-      </w:hyperlink>
-    </w:p>
-    <w:p>
-      <w:pPr>
-        <w:pStyle w:val="ReportBullet"/>
-        <w:keepLines/>
-      </w:pPr>
-      <w:r>
-        <w:t xml:space="preserve">[3] OWASP Juice Shop Project  </w:t>
-      </w:r>
-      <w:hyperlink r:id="rId11">
-        <w:r>
-          <w:rPr>
-            <w:color w:val="0563C1"/>
-            <w:u w:val="single"/>
-          </w:rPr>
-          <w:t>Open official source</w:t>
-        </w:r>
-      </w:hyperlink>
-    </w:p>
-    <w:p>
-      <w:pPr>
-        <w:pStyle w:val="ReportBullet"/>
-        <w:keepLines/>
-      </w:pPr>
-      <w:r>
-        <w:t xml:space="preserve">[4] OWASP Juice Shop v20.2.0 Challenge Catalog  </w:t>
-      </w:r>
-      <w:hyperlink r:id="rId12">
-        <w:r>
-          <w:rPr>
-            <w:color w:val="0563C1"/>
-            <w:u w:val="single"/>
-          </w:rPr>
-          <w:t>Open official source</w:t>
-        </w:r>
-      </w:hyperlink>
-    </w:p>
-    <w:p>
-      <w:pPr>
-        <w:pStyle w:val="ReportBullet"/>
-        <w:keepLines/>
-      </w:pPr>
-      <w:r>
-        <w:t xml:space="preserve">[5] Juice Shop Challenge Tracking Guide  </w:t>
-      </w:r>
-      <w:hyperlink r:id="rId13">
-        <w:r>
-          <w:rPr>
-            <w:color w:val="0563C1"/>
-            <w:u w:val="single"/>
-          </w:rPr>
-          <w:t>Open official source</w:t>
-        </w:r>
-      </w:hyperlink>
-    </w:p>
-    <w:p>
-      <w:pPr>
-        <w:pStyle w:val="ReportBullet"/>
-        <w:keepLines/>
-      </w:pPr>
-      <w:r>
-        <w:t xml:space="preserve">[6] A01 Broken Access Control  </w:t>
-      </w:r>
-      <w:hyperlink r:id="rId14">
-        <w:r>
-          <w:rPr>
-            <w:color w:val="0563C1"/>
-            <w:u w:val="single"/>
-          </w:rPr>
-          <w:t>Open official source</w:t>
-        </w:r>
-      </w:hyperlink>
-    </w:p>
-    <w:p>
-      <w:pPr>
-        <w:pStyle w:val="ReportBullet"/>
-        <w:keepLines/>
-      </w:pPr>
-      <w:r>
-        <w:t xml:space="preserve">[7] A02 Security Misconfiguration  </w:t>
-      </w:r>
-      <w:hyperlink r:id="rId15">
-        <w:r>
-          <w:rPr>
-            <w:color w:val="0563C1"/>
-            <w:u w:val="single"/>
-          </w:rPr>
-          <w:t>Open official source</w:t>
-        </w:r>
-      </w:hyperlink>
-    </w:p>
-    <w:p>
-      <w:pPr>
-        <w:pStyle w:val="ReportBullet"/>
-        <w:keepLines/>
-      </w:pPr>
-      <w:r>
-        <w:t xml:space="preserve">[8] A03 Software Supply Chain Failures  </w:t>
-      </w:r>
-      <w:hyperlink r:id="rId16">
-        <w:r>
-          <w:rPr>
-            <w:color w:val="0563C1"/>
-            <w:u w:val="single"/>
-          </w:rPr>
-          <w:t>Open official source</w:t>
-        </w:r>
-      </w:hyperlink>
-    </w:p>
-    <w:p>
-      <w:pPr>
-        <w:pStyle w:val="ReportBullet"/>
-        <w:keepLines/>
-      </w:pPr>
-      <w:r>
-        <w:t xml:space="preserve">[9] A04 Cryptographic Failures  </w:t>
-      </w:r>
-      <w:hyperlink r:id="rId17">
-        <w:r>
-          <w:rPr>
-            <w:color w:val="0563C1"/>
-            <w:u w:val="single"/>
-          </w:rPr>
-          <w:t>Open official source</w:t>
-        </w:r>
-      </w:hyperlink>
-    </w:p>
-    <w:p>
-      <w:pPr>
-        <w:pStyle w:val="ReportBullet"/>
-        <w:keepLines/>
-      </w:pPr>
-      <w:r>
-        <w:t xml:space="preserve">[10] A05 Injection  </w:t>
-      </w:r>
-      <w:hyperlink r:id="rId18">
-        <w:r>
-          <w:rPr>
-            <w:color w:val="0563C1"/>
-            <w:u w:val="single"/>
-          </w:rPr>
-          <w:t>Open official source</w:t>
-        </w:r>
-      </w:hyperlink>
-    </w:p>
-    <w:p>
-      <w:pPr>
-        <w:pStyle w:val="ReportBullet"/>
-        <w:keepLines/>
-      </w:pPr>
-      <w:r>
-        <w:t xml:space="preserve">[11] A06 Insecure Design  </w:t>
-      </w:r>
-      <w:hyperlink r:id="rId19">
-        <w:r>
-          <w:rPr>
-            <w:color w:val="0563C1"/>
-            <w:u w:val="single"/>
-          </w:rPr>
-          <w:t>Open official source</w:t>
-        </w:r>
-      </w:hyperlink>
-    </w:p>
-    <w:p>
-      <w:pPr>
-        <w:pStyle w:val="ReportBullet"/>
-        <w:keepLines/>
-      </w:pPr>
-      <w:r>
-        <w:t xml:space="preserve">[12] A07 Authentication Failures  </w:t>
-      </w:r>
-      <w:hyperlink r:id="rId20">
-        <w:r>
-          <w:rPr>
-            <w:color w:val="0563C1"/>
-            <w:u w:val="single"/>
-          </w:rPr>
-          <w:t>Open official source</w:t>
-        </w:r>
-      </w:hyperlink>
-    </w:p>
-    <w:p>
-      <w:pPr>
-        <w:pStyle w:val="ReportBullet"/>
-        <w:keepLines/>
-      </w:pPr>
-      <w:r>
-        <w:t xml:space="preserve">[13] A08 Software or Data Integrity Failures  </w:t>
-      </w:r>
-      <w:hyperlink r:id="rId21">
-        <w:r>
-          <w:rPr>
-            <w:color w:val="0563C1"/>
-            <w:u w:val="single"/>
-          </w:rPr>
-          <w:t>Open official source</w:t>
-        </w:r>
-      </w:hyperlink>
-    </w:p>
-    <w:p>
-      <w:pPr>
-        <w:pStyle w:val="ReportBullet"/>
-        <w:keepLines/>
-      </w:pPr>
-      <w:r>
-        <w:t xml:space="preserve">[14] A09 Security Logging and Alerting Failures  </w:t>
-      </w:r>
-      <w:hyperlink r:id="rId22">
-        <w:r>
-          <w:rPr>
-            <w:color w:val="0563C1"/>
-            <w:u w:val="single"/>
-          </w:rPr>
-          <w:t>Open official source</w:t>
-        </w:r>
-      </w:hyperlink>
-    </w:p>
-    <w:p>
-      <w:pPr>
-        <w:pStyle w:val="ReportBullet"/>
-        <w:keepLines/>
-      </w:pPr>
-      <w:r>
-        <w:t xml:space="preserve">[15] A10 Mishandling of Exceptional Conditions  </w:t>
-      </w:r>
-      <w:hyperlink r:id="rId23">
-        <w:r>
-          <w:rPr>
-            <w:color w:val="0563C1"/>
-            <w:u w:val="single"/>
-          </w:rPr>
-          <w:t>Open official source</w:t>
-        </w:r>
-      </w:hyperlink>
     </w:p>
     <w:sectPr>
       <w:footerReference w:type="default" r:id="rId24"/>
@@ -3558,9 +3245,6 @@
     <w:rsid w:val="00FC693F"/>
     <w:pPr>
       <w:keepNext/>
-      <w:pBdr>
-        <w:bottom w:val="single" w:sz="8" w:space="4" w:color="4F81BD" w:themeColor="accent1"/>
-      </w:pBdr>
       <w:spacing w:after="80" w:line="240" w:lineRule="auto" w:before="0"/>
       <w:contextualSpacing/>
     </w:pPr>

</xml_diff>